<commit_message>
Este documento de Word esta configurado con las normas APA
</commit_message>
<xml_diff>
--- a/Trabajo_T2_grupal.docx
+++ b/Trabajo_T2_grupal.docx
@@ -1552,6 +1552,7 @@
       <w:r>
         <w:rPr>
           <w:rFonts w:ascii="Times New Roman" w:hAnsi="Times New Roman" w:cs="Times New Roman"/>
+          <w:noProof/>
           <w:lang w:val="es-MX"/>
         </w:rPr>
         <w:lastRenderedPageBreak/>
@@ -1603,6 +1604,7 @@
       <w:r>
         <w:rPr>
           <w:rFonts w:ascii="Times New Roman" w:hAnsi="Times New Roman" w:cs="Times New Roman"/>
+          <w:noProof/>
           <w:lang w:val="es-MX"/>
         </w:rPr>
         <w:drawing>
@@ -1682,16 +1684,7 @@
           <w:bCs/>
           <w:lang w:val="es-MX"/>
         </w:rPr>
-        <w:t>FUNDAMENTOS TÉCNICOS</w:t>
-      </w:r>
-      <w:r>
-        <w:rPr>
-          <w:rFonts w:ascii="Times New Roman" w:hAnsi="Times New Roman" w:cs="Times New Roman"/>
-          <w:b/>
-          <w:bCs/>
-          <w:lang w:val="es-MX"/>
-        </w:rPr>
-        <w:t xml:space="preserve"> </w:t>
+        <w:t xml:space="preserve">FUNDAMENTOS TÉCNICOS </w:t>
       </w:r>
     </w:p>
     <w:p>
@@ -1772,15 +1765,7 @@
           <w:b/>
           <w:bCs/>
         </w:rPr>
-        <w:t>M</w:t>
-      </w:r>
-      <w:r>
-        <w:rPr>
-          <w:rFonts w:ascii="Times New Roman" w:hAnsi="Times New Roman" w:cs="Times New Roman"/>
-          <w:b/>
-          <w:bCs/>
-        </w:rPr>
-        <w:t>anejo de errores</w:t>
+        <w:t>Manejo de errores</w:t>
       </w:r>
     </w:p>
     <w:p>
@@ -1886,10 +1871,7 @@
         <w:t>&lt;Venta&gt;</w:t>
       </w:r>
       <w:r>
-        <w:t xml:space="preserve"> </w:t>
-      </w:r>
-      <w:r>
-        <w:t xml:space="preserve">para registrar múltiples acciones. </w:t>
+        <w:t xml:space="preserve"> para registrar múltiples acciones. </w:t>
       </w:r>
     </w:p>
     <w:p>
@@ -1950,10 +1932,7 @@
         <w:t>, Productos&gt;</w:t>
       </w:r>
       <w:r>
-        <w:t xml:space="preserve"> p</w:t>
-      </w:r>
-      <w:r>
-        <w:t xml:space="preserve">ara acceder rápidamente al código. </w:t>
+        <w:t xml:space="preserve"> para acceder rápidamente al código. </w:t>
       </w:r>
     </w:p>
     <w:p>
@@ -2020,13 +1999,7 @@
         <w:t>:</w:t>
       </w:r>
       <w:r>
-        <w:t xml:space="preserve"> </w:t>
-      </w:r>
-      <w:r>
-        <w:t>Permite un acceso rápido a los productos por su nombre, lo cual es fundamental para buscar y actualizar información en un inventario. La búsqueda por nombre es 0 (1) en promedio.</w:t>
-      </w:r>
-      <w:r>
-        <w:t xml:space="preserve"> </w:t>
+        <w:t xml:space="preserve"> Permite un acceso rápido a los productos por su nombre, lo cual es fundamental para buscar y actualizar información en un inventario. La búsqueda por nombre es 0 (1) en promedio. </w:t>
       </w:r>
     </w:p>
     <w:p>
@@ -2063,22 +2036,7 @@
         <w:t>:</w:t>
       </w:r>
       <w:r>
-        <w:t xml:space="preserve"> </w:t>
-      </w:r>
-      <w:r>
-        <w:t xml:space="preserve"> </w:t>
-      </w:r>
-      <w:r>
-        <w:t>Pro</w:t>
-      </w:r>
-      <w:r>
-        <w:t>p</w:t>
-      </w:r>
-      <w:r>
-        <w:t>orciona una formula sencilla de almacenar una lista de productos manteniendo el orden de inserción. Esto podría ser útil para mostrar la lista de productos en un orden especifico</w:t>
-      </w:r>
-      <w:r>
-        <w:t xml:space="preserve">. </w:t>
+        <w:t xml:space="preserve">  Proporciona una formula sencilla de almacenar una lista de productos manteniendo el orden de inserción. Esto podría ser útil para mostrar la lista de productos en un orden especifico. </w:t>
       </w:r>
     </w:p>
     <w:p>
@@ -2433,6 +2391,16 @@
         </w:rPr>
         <w:t>. Morgan Kaufmann.</w:t>
       </w:r>
+    </w:p>
+    <w:p>
+      <w:pPr>
+        <w:spacing w:before="100" w:beforeAutospacing="1" w:after="100" w:afterAutospacing="1" w:line="240" w:lineRule="auto"/>
+        <w:ind w:left="1788"/>
+        <w:rPr>
+          <w:rFonts w:ascii="Times New Roman" w:eastAsia="Times New Roman" w:hAnsi="Times New Roman" w:cs="Times New Roman"/>
+          <w:lang w:val="en-US" w:eastAsia="es-PE"/>
+        </w:rPr>
+      </w:pPr>
     </w:p>
     <w:p>
       <w:pPr>
@@ -3148,6 +3116,7 @@
           <w:bCs/>
           <w:lang w:eastAsia="es-PE"/>
         </w:rPr>
+        <w:lastRenderedPageBreak/>
         <w:t>Alcance:</w:t>
       </w:r>
       <w:r>
@@ -3197,522 +3166,522 @@
           <w:bCs/>
           <w:lang w:val="es-MX"/>
         </w:rPr>
+        <w:t>REQUERIMIENTOS FUNCIONALES E HISTORIAS DE USUARIO</w:t>
+      </w:r>
+    </w:p>
+    <w:p>
+      <w:pPr>
+        <w:ind w:firstLine="360"/>
+        <w:rPr>
+          <w:rFonts w:ascii="Times New Roman" w:hAnsi="Times New Roman" w:cs="Times New Roman"/>
+          <w:b/>
+          <w:bCs/>
+          <w:u w:val="single"/>
+        </w:rPr>
+      </w:pPr>
+      <w:r>
+        <w:rPr>
+          <w:rFonts w:ascii="Times New Roman" w:hAnsi="Times New Roman" w:cs="Times New Roman"/>
+          <w:b/>
+          <w:bCs/>
+          <w:u w:val="single"/>
+        </w:rPr>
+        <w:t>P</w:t>
+      </w:r>
+      <w:r>
+        <w:rPr>
+          <w:rFonts w:ascii="Times New Roman" w:hAnsi="Times New Roman" w:cs="Times New Roman"/>
+          <w:b/>
+          <w:bCs/>
+          <w:u w:val="single"/>
+        </w:rPr>
+        <w:t>roductos e Inventario</w:t>
+      </w:r>
+    </w:p>
+    <w:p>
+      <w:pPr>
+        <w:pStyle w:val="Prrafodelista"/>
+        <w:numPr>
+          <w:ilvl w:val="0"/>
+          <w:numId w:val="1"/>
+        </w:numPr>
+        <w:ind w:left="426" w:hanging="66"/>
+        <w:jc w:val="both"/>
+        <w:rPr>
+          <w:rFonts w:ascii="Times New Roman" w:hAnsi="Times New Roman" w:cs="Times New Roman"/>
+          <w:b/>
+          <w:bCs/>
+        </w:rPr>
+      </w:pPr>
+      <w:r>
+        <w:rPr>
+          <w:rFonts w:ascii="Times New Roman" w:hAnsi="Times New Roman" w:cs="Times New Roman"/>
+          <w:b/>
+          <w:bCs/>
+        </w:rPr>
+        <w:t>El sistema debe permitir registrar un Usuario y contraseña</w:t>
+      </w:r>
+      <w:r>
+        <w:rPr>
+          <w:rFonts w:ascii="Times New Roman" w:hAnsi="Times New Roman" w:cs="Times New Roman"/>
+          <w:b/>
+          <w:bCs/>
+        </w:rPr>
+        <w:t>:</w:t>
+      </w:r>
+      <w:r>
+        <w:rPr>
+          <w:rFonts w:ascii="Times New Roman" w:hAnsi="Times New Roman" w:cs="Times New Roman"/>
+        </w:rPr>
+        <w:t xml:space="preserve"> permitir que un </w:t>
+      </w:r>
+      <w:r>
+        <w:rPr>
+          <w:rFonts w:ascii="Times New Roman" w:hAnsi="Times New Roman" w:cs="Times New Roman"/>
+        </w:rPr>
+        <w:t xml:space="preserve">  </w:t>
+      </w:r>
+      <w:r>
+        <w:rPr>
+          <w:rFonts w:ascii="Times New Roman" w:hAnsi="Times New Roman" w:cs="Times New Roman"/>
+        </w:rPr>
+        <w:t>usuario registre su nombre de usuario y una contraseña segura.</w:t>
+      </w:r>
+    </w:p>
+    <w:p>
+      <w:pPr>
+        <w:pStyle w:val="Prrafodelista"/>
+        <w:numPr>
+          <w:ilvl w:val="0"/>
+          <w:numId w:val="1"/>
+        </w:numPr>
+        <w:ind w:left="426" w:hanging="66"/>
+        <w:jc w:val="both"/>
+        <w:rPr>
+          <w:rFonts w:ascii="Times New Roman" w:hAnsi="Times New Roman" w:cs="Times New Roman"/>
+          <w:b/>
+          <w:bCs/>
+        </w:rPr>
+      </w:pPr>
+      <w:r>
+        <w:rPr>
+          <w:rFonts w:ascii="Times New Roman" w:hAnsi="Times New Roman" w:cs="Times New Roman"/>
+          <w:b/>
+          <w:bCs/>
+        </w:rPr>
+        <w:t>El sistema debe permitir registrar un nuevo producto en el inventario</w:t>
+      </w:r>
+      <w:r>
+        <w:rPr>
+          <w:rFonts w:ascii="Times New Roman" w:hAnsi="Times New Roman" w:cs="Times New Roman"/>
+          <w:b/>
+          <w:bCs/>
+        </w:rPr>
+        <w:t xml:space="preserve">: </w:t>
+      </w:r>
+      <w:r>
+        <w:rPr>
+          <w:rFonts w:ascii="Times New Roman" w:hAnsi="Times New Roman" w:cs="Times New Roman"/>
+        </w:rPr>
+        <w:t>el sistema debe capturar y almacenar información esencial que te permita gestionarlo una ficha de identidad.</w:t>
+      </w:r>
+    </w:p>
+    <w:p>
+      <w:pPr>
+        <w:pStyle w:val="Prrafodelista"/>
+        <w:numPr>
+          <w:ilvl w:val="0"/>
+          <w:numId w:val="1"/>
+        </w:numPr>
+        <w:ind w:left="426" w:hanging="66"/>
+        <w:jc w:val="both"/>
+        <w:rPr>
+          <w:rFonts w:ascii="Times New Roman" w:hAnsi="Times New Roman" w:cs="Times New Roman"/>
+          <w:b/>
+          <w:bCs/>
+        </w:rPr>
+      </w:pPr>
+      <w:r>
+        <w:rPr>
+          <w:rFonts w:ascii="Times New Roman" w:hAnsi="Times New Roman" w:cs="Times New Roman"/>
+          <w:b/>
+          <w:bCs/>
+        </w:rPr>
+        <w:t>Registrar nuevo producto con: código, nombre, descripción, precio, categoría, stock</w:t>
+      </w:r>
+      <w:r>
+        <w:rPr>
+          <w:rFonts w:ascii="Times New Roman" w:hAnsi="Times New Roman" w:cs="Times New Roman"/>
+          <w:b/>
+          <w:bCs/>
+        </w:rPr>
+        <w:t xml:space="preserve">: </w:t>
+      </w:r>
+      <w:r>
+        <w:rPr>
+          <w:rFonts w:ascii="Times New Roman" w:hAnsi="Times New Roman" w:cs="Times New Roman"/>
+        </w:rPr>
+        <w:t>El sistema permitirá al usuario ingresar la información esencial para identificar y gestionar un producto dentro del inventario</w:t>
+      </w:r>
+      <w:r>
+        <w:rPr>
+          <w:rFonts w:ascii="Times New Roman" w:hAnsi="Times New Roman" w:cs="Times New Roman"/>
+        </w:rPr>
+        <w:t>.</w:t>
+      </w:r>
+    </w:p>
+    <w:p>
+      <w:pPr>
+        <w:pStyle w:val="Prrafodelista"/>
+        <w:numPr>
+          <w:ilvl w:val="0"/>
+          <w:numId w:val="1"/>
+        </w:numPr>
+        <w:ind w:left="426" w:hanging="66"/>
+        <w:jc w:val="both"/>
+        <w:rPr>
+          <w:rFonts w:ascii="Times New Roman" w:hAnsi="Times New Roman" w:cs="Times New Roman"/>
+          <w:b/>
+          <w:bCs/>
+        </w:rPr>
+      </w:pPr>
+      <w:r>
+        <w:rPr>
+          <w:rFonts w:ascii="Times New Roman" w:hAnsi="Times New Roman" w:cs="Times New Roman"/>
+          <w:b/>
+          <w:bCs/>
+        </w:rPr>
+        <w:t xml:space="preserve">El sistema debe validar que el nombre de un producto no esté vacío. </w:t>
+      </w:r>
+      <w:r>
+        <w:rPr>
+          <w:rFonts w:ascii="Times New Roman" w:hAnsi="Times New Roman" w:cs="Times New Roman"/>
+        </w:rPr>
+        <w:t>El sistema debe comprobar de manera específica que el campo "Nombre del Producto" no esté vacío, es decir, que contenga al menos algún carácter. Si el campo se encuentra sin información, el sistema debe detener el registro y mostrar un mensaje al usuario indicando que este campo es requerido y no puede dejarse en blanco.</w:t>
+      </w:r>
+    </w:p>
+    <w:p>
+      <w:pPr>
+        <w:pStyle w:val="Prrafodelista"/>
+        <w:numPr>
+          <w:ilvl w:val="0"/>
+          <w:numId w:val="1"/>
+        </w:numPr>
+        <w:ind w:left="426" w:hanging="66"/>
+        <w:jc w:val="both"/>
+        <w:rPr>
+          <w:rFonts w:ascii="Times New Roman" w:hAnsi="Times New Roman" w:cs="Times New Roman"/>
+          <w:b/>
+          <w:bCs/>
+        </w:rPr>
+      </w:pPr>
+      <w:r>
+        <w:rPr>
+          <w:rFonts w:ascii="Times New Roman" w:hAnsi="Times New Roman" w:cs="Times New Roman"/>
+          <w:b/>
+          <w:bCs/>
+        </w:rPr>
+        <w:t>El sistema debe validar que el ID de un producto no esté duplicado al registrarse</w:t>
+      </w:r>
+      <w:r>
+        <w:rPr>
+          <w:rFonts w:ascii="Times New Roman" w:hAnsi="Times New Roman" w:cs="Times New Roman"/>
+          <w:b/>
+          <w:bCs/>
+        </w:rPr>
+        <w:t xml:space="preserve">: </w:t>
+      </w:r>
+      <w:r>
+        <w:rPr>
+          <w:rFonts w:ascii="Times New Roman" w:hAnsi="Times New Roman" w:cs="Times New Roman"/>
+        </w:rPr>
+        <w:t>la validación de ID es un mecanismo de control de datos esencial que garantiza que cada producto en tu inventario sea único e inequívocamente identificable, previniendo errores y manteniendo la coherencia de tu información.</w:t>
+      </w:r>
+    </w:p>
+    <w:p>
+      <w:pPr>
+        <w:pStyle w:val="Prrafodelista"/>
+        <w:numPr>
+          <w:ilvl w:val="0"/>
+          <w:numId w:val="1"/>
+        </w:numPr>
+        <w:ind w:left="426" w:hanging="66"/>
+        <w:jc w:val="both"/>
+        <w:rPr>
+          <w:rFonts w:ascii="Times New Roman" w:hAnsi="Times New Roman" w:cs="Times New Roman"/>
+          <w:b/>
+          <w:bCs/>
+        </w:rPr>
+      </w:pPr>
+      <w:r>
+        <w:rPr>
+          <w:rFonts w:ascii="Times New Roman" w:hAnsi="Times New Roman" w:cs="Times New Roman"/>
+          <w:b/>
+          <w:bCs/>
+        </w:rPr>
+        <w:t>El sistema debe validar que el precio de un producto sea mayor a cero:</w:t>
+      </w:r>
+      <w:r>
+        <w:rPr>
+          <w:rFonts w:ascii="Times New Roman" w:hAnsi="Times New Roman" w:cs="Times New Roman"/>
+        </w:rPr>
+        <w:t xml:space="preserve"> Si el precio es cero o un número negativo, el sistema rechazará la operación y mostrará un mensaje de error claro al usuario, como: "El precio del producto debe ser un valor numérico mayor a cero".</w:t>
+      </w:r>
+    </w:p>
+    <w:p>
+      <w:pPr>
+        <w:pStyle w:val="Prrafodelista"/>
+        <w:numPr>
+          <w:ilvl w:val="0"/>
+          <w:numId w:val="1"/>
+        </w:numPr>
+        <w:ind w:left="426" w:hanging="66"/>
+        <w:jc w:val="both"/>
+        <w:rPr>
+          <w:rFonts w:ascii="Times New Roman" w:hAnsi="Times New Roman" w:cs="Times New Roman"/>
+          <w:b/>
+          <w:bCs/>
+        </w:rPr>
+      </w:pPr>
+      <w:r>
+        <w:rPr>
+          <w:rFonts w:ascii="Times New Roman" w:hAnsi="Times New Roman" w:cs="Times New Roman"/>
+          <w:b/>
+          <w:bCs/>
+        </w:rPr>
+        <w:t>Buscar productos por: código, nombre, categoría o rango de precios</w:t>
+      </w:r>
+      <w:r>
+        <w:rPr>
+          <w:rFonts w:ascii="Times New Roman" w:hAnsi="Times New Roman" w:cs="Times New Roman"/>
+          <w:b/>
+          <w:bCs/>
+        </w:rPr>
+        <w:t xml:space="preserve">: </w:t>
+      </w:r>
+      <w:r>
+        <w:rPr>
+          <w:rFonts w:ascii="Times New Roman" w:hAnsi="Times New Roman" w:cs="Times New Roman"/>
+        </w:rPr>
+        <w:t>permite a los usuarios localizar productos de manera rápida y eficiente utilizando diferentes criterios.</w:t>
+      </w:r>
+    </w:p>
+    <w:p>
+      <w:pPr>
+        <w:pStyle w:val="Prrafodelista"/>
+        <w:numPr>
+          <w:ilvl w:val="0"/>
+          <w:numId w:val="1"/>
+        </w:numPr>
+        <w:ind w:left="426" w:hanging="66"/>
+        <w:jc w:val="both"/>
+        <w:rPr>
+          <w:rFonts w:ascii="Times New Roman" w:hAnsi="Times New Roman" w:cs="Times New Roman"/>
+          <w:b/>
+          <w:bCs/>
+        </w:rPr>
+      </w:pPr>
+      <w:r>
+        <w:rPr>
+          <w:rFonts w:ascii="Times New Roman" w:eastAsia="Times New Roman" w:hAnsi="Times New Roman" w:cs="Times New Roman"/>
+          <w:b/>
+          <w:bCs/>
+          <w:color w:val="404040"/>
+          <w:kern w:val="0"/>
+          <w:lang w:eastAsia="es-PE"/>
+          <w14:ligatures w14:val="none"/>
+        </w:rPr>
+        <w:t>Alertar cuando stock sea menor a cantidad mínima configurable</w:t>
+      </w:r>
+      <w:r>
+        <w:rPr>
+          <w:rFonts w:ascii="Times New Roman" w:eastAsia="Times New Roman" w:hAnsi="Times New Roman" w:cs="Times New Roman"/>
+          <w:b/>
+          <w:bCs/>
+          <w:color w:val="404040"/>
+          <w:kern w:val="0"/>
+          <w:lang w:eastAsia="es-PE"/>
+          <w14:ligatures w14:val="none"/>
+        </w:rPr>
+        <w:t xml:space="preserve">: </w:t>
+      </w:r>
+      <w:r>
+        <w:rPr>
+          <w:rFonts w:ascii="Times New Roman" w:eastAsia="Times New Roman" w:hAnsi="Times New Roman" w:cs="Times New Roman"/>
+          <w:color w:val="404040"/>
+          <w:kern w:val="0"/>
+          <w:lang w:eastAsia="es-PE"/>
+          <w14:ligatures w14:val="none"/>
+        </w:rPr>
+        <w:t>permite al sistema monitorear automáticamente la cantidad de un producto en stock y generar una notificación o advertencia cuando dicha cantidad desciende</w:t>
+      </w:r>
+    </w:p>
+    <w:p>
+      <w:pPr>
+        <w:pStyle w:val="Prrafodelista"/>
+        <w:numPr>
+          <w:ilvl w:val="0"/>
+          <w:numId w:val="1"/>
+        </w:numPr>
+        <w:ind w:left="426" w:hanging="66"/>
+        <w:jc w:val="both"/>
+        <w:rPr>
+          <w:rFonts w:ascii="Times New Roman" w:hAnsi="Times New Roman" w:cs="Times New Roman"/>
+          <w:b/>
+          <w:bCs/>
+        </w:rPr>
+      </w:pPr>
+      <w:r>
+        <w:rPr>
+          <w:rFonts w:ascii="Times New Roman" w:hAnsi="Times New Roman" w:cs="Times New Roman"/>
+          <w:b/>
+          <w:bCs/>
+        </w:rPr>
+        <w:t>El sistema debe permitir consultar los detalles de un producto por su ID</w:t>
+      </w:r>
+      <w:r>
+        <w:rPr>
+          <w:rFonts w:ascii="Times New Roman" w:hAnsi="Times New Roman" w:cs="Times New Roman"/>
+          <w:b/>
+          <w:bCs/>
+        </w:rPr>
+        <w:t xml:space="preserve">: </w:t>
+      </w:r>
+      <w:r>
+        <w:rPr>
+          <w:rFonts w:ascii="Times New Roman" w:hAnsi="Times New Roman" w:cs="Times New Roman"/>
+        </w:rPr>
+        <w:t>Permite recuperar toda la información asociada a un producto específico de manera rápida y precisa, utilizando su identificador único.</w:t>
+      </w:r>
+    </w:p>
+    <w:p>
+      <w:pPr>
+        <w:pStyle w:val="Prrafodelista"/>
+        <w:numPr>
+          <w:ilvl w:val="0"/>
+          <w:numId w:val="1"/>
+        </w:numPr>
+        <w:ind w:left="426" w:hanging="66"/>
+        <w:jc w:val="both"/>
+        <w:rPr>
+          <w:rFonts w:ascii="Times New Roman" w:hAnsi="Times New Roman" w:cs="Times New Roman"/>
+          <w:b/>
+          <w:bCs/>
+        </w:rPr>
+      </w:pPr>
+      <w:r>
+        <w:rPr>
+          <w:rFonts w:ascii="Times New Roman" w:hAnsi="Times New Roman" w:cs="Times New Roman"/>
+          <w:b/>
+          <w:bCs/>
+        </w:rPr>
+        <w:t xml:space="preserve">El sistema debe permitir eliminar un producto del inventario por su ID: </w:t>
+      </w:r>
+      <w:r>
+        <w:rPr>
+          <w:rFonts w:ascii="Times New Roman" w:hAnsi="Times New Roman" w:cs="Times New Roman"/>
+        </w:rPr>
+        <w:t>Permite eliminar un producto, el sistema necesita que le proporciones ese ID único del producto que deseas remover.</w:t>
+      </w:r>
+    </w:p>
+    <w:p>
+      <w:pPr>
+        <w:pStyle w:val="Prrafodelista"/>
+        <w:numPr>
+          <w:ilvl w:val="0"/>
+          <w:numId w:val="1"/>
+        </w:numPr>
+        <w:ind w:left="426" w:hanging="66"/>
+        <w:jc w:val="both"/>
+        <w:rPr>
+          <w:rFonts w:ascii="Times New Roman" w:hAnsi="Times New Roman" w:cs="Times New Roman"/>
+          <w:b/>
+          <w:bCs/>
+        </w:rPr>
+      </w:pPr>
+      <w:r>
+        <w:rPr>
+          <w:rFonts w:ascii="Times New Roman" w:hAnsi="Times New Roman" w:cs="Times New Roman"/>
+          <w:b/>
+          <w:bCs/>
+        </w:rPr>
+        <w:t>Gestionar promociones (descuentos por producto/categoría)</w:t>
+      </w:r>
+      <w:r>
+        <w:rPr>
+          <w:rFonts w:ascii="Times New Roman" w:hAnsi="Times New Roman" w:cs="Times New Roman"/>
+          <w:b/>
+          <w:bCs/>
+        </w:rPr>
+        <w:t xml:space="preserve">: </w:t>
+      </w:r>
+      <w:r>
+        <w:rPr>
+          <w:rFonts w:ascii="Times New Roman" w:hAnsi="Times New Roman" w:cs="Times New Roman"/>
+        </w:rPr>
+        <w:t>Permite seleccionar uno o varios productos concretos para aplicar un descuento determinado.</w:t>
+      </w:r>
+    </w:p>
+    <w:p>
+      <w:pPr>
+        <w:pStyle w:val="Prrafodelista"/>
+        <w:numPr>
+          <w:ilvl w:val="0"/>
+          <w:numId w:val="1"/>
+        </w:numPr>
+        <w:ind w:left="426" w:hanging="66"/>
+        <w:jc w:val="both"/>
+        <w:rPr>
+          <w:rFonts w:ascii="Times New Roman" w:hAnsi="Times New Roman" w:cs="Times New Roman"/>
+          <w:b/>
+          <w:bCs/>
+        </w:rPr>
+      </w:pPr>
+      <w:r>
+        <w:rPr>
+          <w:rFonts w:ascii="Times New Roman" w:hAnsi="Times New Roman" w:cs="Times New Roman"/>
+          <w:b/>
+          <w:bCs/>
+        </w:rPr>
+        <w:t>El sistema debe listar todos los productos actualmente en el inventario</w:t>
+      </w:r>
+      <w:r>
+        <w:rPr>
+          <w:rFonts w:ascii="Times New Roman" w:hAnsi="Times New Roman" w:cs="Times New Roman"/>
+          <w:b/>
+          <w:bCs/>
+        </w:rPr>
+        <w:t>:</w:t>
+      </w:r>
+      <w:r>
+        <w:rPr>
+          <w:rFonts w:ascii="Times New Roman" w:hAnsi="Times New Roman" w:cs="Times New Roman"/>
+        </w:rPr>
+        <w:t xml:space="preserve"> Permite visualizar de forma clara y organizada todos los artículos disponibles.</w:t>
+      </w:r>
+    </w:p>
+    <w:p>
+      <w:pPr>
+        <w:pStyle w:val="Prrafodelista"/>
+        <w:numPr>
+          <w:ilvl w:val="0"/>
+          <w:numId w:val="1"/>
+        </w:numPr>
+        <w:ind w:left="426" w:hanging="66"/>
+        <w:jc w:val="both"/>
+        <w:rPr>
+          <w:rFonts w:ascii="Times New Roman" w:hAnsi="Times New Roman" w:cs="Times New Roman"/>
+          <w:b/>
+          <w:bCs/>
+        </w:rPr>
+      </w:pPr>
+      <w:r>
+        <w:rPr>
+          <w:rFonts w:ascii="Times New Roman" w:hAnsi="Times New Roman" w:cs="Times New Roman"/>
+          <w:b/>
+          <w:bCs/>
+        </w:rPr>
         <w:lastRenderedPageBreak/>
-        <w:t>REQUERIMIENTOS FUNCIONALES E HISTORIAS DE USUARIO</w:t>
-      </w:r>
-    </w:p>
-    <w:p>
-      <w:pPr>
-        <w:ind w:firstLine="360"/>
-        <w:rPr>
-          <w:rFonts w:ascii="Times New Roman" w:hAnsi="Times New Roman" w:cs="Times New Roman"/>
-          <w:b/>
-          <w:bCs/>
-          <w:u w:val="single"/>
-        </w:rPr>
-      </w:pPr>
-      <w:r>
-        <w:rPr>
-          <w:rFonts w:ascii="Times New Roman" w:hAnsi="Times New Roman" w:cs="Times New Roman"/>
-          <w:b/>
-          <w:bCs/>
-          <w:u w:val="single"/>
-        </w:rPr>
-        <w:t>P</w:t>
-      </w:r>
-      <w:r>
-        <w:rPr>
-          <w:rFonts w:ascii="Times New Roman" w:hAnsi="Times New Roman" w:cs="Times New Roman"/>
-          <w:b/>
-          <w:bCs/>
-          <w:u w:val="single"/>
-        </w:rPr>
-        <w:t>roductos e Inventario</w:t>
-      </w:r>
-    </w:p>
-    <w:p>
-      <w:pPr>
-        <w:pStyle w:val="Prrafodelista"/>
-        <w:numPr>
-          <w:ilvl w:val="0"/>
-          <w:numId w:val="1"/>
-        </w:numPr>
-        <w:ind w:left="426" w:hanging="66"/>
-        <w:jc w:val="both"/>
-        <w:rPr>
-          <w:rFonts w:ascii="Times New Roman" w:hAnsi="Times New Roman" w:cs="Times New Roman"/>
-          <w:b/>
-          <w:bCs/>
-        </w:rPr>
-      </w:pPr>
-      <w:r>
-        <w:rPr>
-          <w:rFonts w:ascii="Times New Roman" w:hAnsi="Times New Roman" w:cs="Times New Roman"/>
-          <w:b/>
-          <w:bCs/>
-        </w:rPr>
-        <w:t>El sistema debe permitir registrar un Usuario y contraseña</w:t>
-      </w:r>
-      <w:r>
-        <w:rPr>
-          <w:rFonts w:ascii="Times New Roman" w:hAnsi="Times New Roman" w:cs="Times New Roman"/>
-          <w:b/>
-          <w:bCs/>
-        </w:rPr>
-        <w:t>:</w:t>
-      </w:r>
-      <w:r>
-        <w:rPr>
-          <w:rFonts w:ascii="Times New Roman" w:hAnsi="Times New Roman" w:cs="Times New Roman"/>
-        </w:rPr>
-        <w:t xml:space="preserve"> permitir que un </w:t>
-      </w:r>
-      <w:r>
-        <w:rPr>
-          <w:rFonts w:ascii="Times New Roman" w:hAnsi="Times New Roman" w:cs="Times New Roman"/>
-        </w:rPr>
-        <w:t xml:space="preserve">  </w:t>
-      </w:r>
-      <w:r>
-        <w:rPr>
-          <w:rFonts w:ascii="Times New Roman" w:hAnsi="Times New Roman" w:cs="Times New Roman"/>
-        </w:rPr>
-        <w:t>usuario registre su nombre de usuario y una contraseña segura.</w:t>
-      </w:r>
-    </w:p>
-    <w:p>
-      <w:pPr>
-        <w:pStyle w:val="Prrafodelista"/>
-        <w:numPr>
-          <w:ilvl w:val="0"/>
-          <w:numId w:val="1"/>
-        </w:numPr>
-        <w:ind w:left="426" w:hanging="66"/>
-        <w:jc w:val="both"/>
-        <w:rPr>
-          <w:rFonts w:ascii="Times New Roman" w:hAnsi="Times New Roman" w:cs="Times New Roman"/>
-          <w:b/>
-          <w:bCs/>
-        </w:rPr>
-      </w:pPr>
-      <w:r>
-        <w:rPr>
-          <w:rFonts w:ascii="Times New Roman" w:hAnsi="Times New Roman" w:cs="Times New Roman"/>
-          <w:b/>
-          <w:bCs/>
-        </w:rPr>
-        <w:t>El sistema debe permitir registrar un nuevo producto en el inventario</w:t>
-      </w:r>
-      <w:r>
-        <w:rPr>
-          <w:rFonts w:ascii="Times New Roman" w:hAnsi="Times New Roman" w:cs="Times New Roman"/>
-          <w:b/>
-          <w:bCs/>
-        </w:rPr>
-        <w:t xml:space="preserve">: </w:t>
-      </w:r>
-      <w:r>
-        <w:rPr>
-          <w:rFonts w:ascii="Times New Roman" w:hAnsi="Times New Roman" w:cs="Times New Roman"/>
-        </w:rPr>
-        <w:t>el sistema debe capturar y almacenar información esencial que te permita gestionarlo una ficha de identidad.</w:t>
-      </w:r>
-    </w:p>
-    <w:p>
-      <w:pPr>
-        <w:pStyle w:val="Prrafodelista"/>
-        <w:numPr>
-          <w:ilvl w:val="0"/>
-          <w:numId w:val="1"/>
-        </w:numPr>
-        <w:ind w:left="426" w:hanging="66"/>
-        <w:jc w:val="both"/>
-        <w:rPr>
-          <w:rFonts w:ascii="Times New Roman" w:hAnsi="Times New Roman" w:cs="Times New Roman"/>
-          <w:b/>
-          <w:bCs/>
-        </w:rPr>
-      </w:pPr>
-      <w:r>
-        <w:rPr>
-          <w:rFonts w:ascii="Times New Roman" w:hAnsi="Times New Roman" w:cs="Times New Roman"/>
-          <w:b/>
-          <w:bCs/>
-        </w:rPr>
-        <w:t>Registrar nuevo producto con: código, nombre, descripción, precio, categoría, stock</w:t>
-      </w:r>
-      <w:r>
-        <w:rPr>
-          <w:rFonts w:ascii="Times New Roman" w:hAnsi="Times New Roman" w:cs="Times New Roman"/>
-          <w:b/>
-          <w:bCs/>
-        </w:rPr>
-        <w:t xml:space="preserve">: </w:t>
-      </w:r>
-      <w:r>
-        <w:rPr>
-          <w:rFonts w:ascii="Times New Roman" w:hAnsi="Times New Roman" w:cs="Times New Roman"/>
-        </w:rPr>
-        <w:t>El sistema permitirá al usuario ingresar la información esencial para identificar y gestionar un producto dentro del inventario</w:t>
-      </w:r>
-      <w:r>
-        <w:rPr>
-          <w:rFonts w:ascii="Times New Roman" w:hAnsi="Times New Roman" w:cs="Times New Roman"/>
-        </w:rPr>
-        <w:t>.</w:t>
-      </w:r>
-    </w:p>
-    <w:p>
-      <w:pPr>
-        <w:pStyle w:val="Prrafodelista"/>
-        <w:numPr>
-          <w:ilvl w:val="0"/>
-          <w:numId w:val="1"/>
-        </w:numPr>
-        <w:ind w:left="426" w:hanging="66"/>
-        <w:jc w:val="both"/>
-        <w:rPr>
-          <w:rFonts w:ascii="Times New Roman" w:hAnsi="Times New Roman" w:cs="Times New Roman"/>
-          <w:b/>
-          <w:bCs/>
-        </w:rPr>
-      </w:pPr>
-      <w:r>
-        <w:rPr>
-          <w:rFonts w:ascii="Times New Roman" w:hAnsi="Times New Roman" w:cs="Times New Roman"/>
-          <w:b/>
-          <w:bCs/>
-        </w:rPr>
-        <w:t xml:space="preserve">El sistema debe validar que el nombre de un producto no esté vacío. </w:t>
-      </w:r>
-      <w:r>
-        <w:rPr>
-          <w:rFonts w:ascii="Times New Roman" w:hAnsi="Times New Roman" w:cs="Times New Roman"/>
-        </w:rPr>
-        <w:t>El sistema debe comprobar de manera específica que el campo "Nombre del Producto" no esté vacío, es decir, que contenga al menos algún carácter. Si el campo se encuentra sin información, el sistema debe detener el registro y mostrar un mensaje al usuario indicando que este campo es requerido y no puede dejarse en blanco.</w:t>
-      </w:r>
-    </w:p>
-    <w:p>
-      <w:pPr>
-        <w:pStyle w:val="Prrafodelista"/>
-        <w:numPr>
-          <w:ilvl w:val="0"/>
-          <w:numId w:val="1"/>
-        </w:numPr>
-        <w:ind w:left="426" w:hanging="66"/>
-        <w:jc w:val="both"/>
-        <w:rPr>
-          <w:rFonts w:ascii="Times New Roman" w:hAnsi="Times New Roman" w:cs="Times New Roman"/>
-          <w:b/>
-          <w:bCs/>
-        </w:rPr>
-      </w:pPr>
-      <w:r>
-        <w:rPr>
-          <w:rFonts w:ascii="Times New Roman" w:hAnsi="Times New Roman" w:cs="Times New Roman"/>
-          <w:b/>
-          <w:bCs/>
-        </w:rPr>
-        <w:t>El sistema debe validar que el ID de un producto no esté duplicado al registrarse</w:t>
-      </w:r>
-      <w:r>
-        <w:rPr>
-          <w:rFonts w:ascii="Times New Roman" w:hAnsi="Times New Roman" w:cs="Times New Roman"/>
-          <w:b/>
-          <w:bCs/>
-        </w:rPr>
-        <w:t xml:space="preserve">: </w:t>
-      </w:r>
-      <w:r>
-        <w:rPr>
-          <w:rFonts w:ascii="Times New Roman" w:hAnsi="Times New Roman" w:cs="Times New Roman"/>
-        </w:rPr>
-        <w:t>la validación de ID es un mecanismo de control de datos esencial que garantiza que cada producto en tu inventario sea único e inequívocamente identificable, previniendo errores y manteniendo la coherencia de tu información.</w:t>
-      </w:r>
-    </w:p>
-    <w:p>
-      <w:pPr>
-        <w:pStyle w:val="Prrafodelista"/>
-        <w:numPr>
-          <w:ilvl w:val="0"/>
-          <w:numId w:val="1"/>
-        </w:numPr>
-        <w:ind w:left="426" w:hanging="66"/>
-        <w:jc w:val="both"/>
-        <w:rPr>
-          <w:rFonts w:ascii="Times New Roman" w:hAnsi="Times New Roman" w:cs="Times New Roman"/>
-          <w:b/>
-          <w:bCs/>
-        </w:rPr>
-      </w:pPr>
-      <w:r>
-        <w:rPr>
-          <w:rFonts w:ascii="Times New Roman" w:hAnsi="Times New Roman" w:cs="Times New Roman"/>
-          <w:b/>
-          <w:bCs/>
-        </w:rPr>
-        <w:t>El sistema debe validar que el precio de un producto sea mayor a cero:</w:t>
-      </w:r>
-      <w:r>
-        <w:rPr>
-          <w:rFonts w:ascii="Times New Roman" w:hAnsi="Times New Roman" w:cs="Times New Roman"/>
-        </w:rPr>
-        <w:t xml:space="preserve"> Si el precio es cero o un número negativo, el sistema rechazará la operación y mostrará un mensaje de error claro al usuario, como: "El precio del producto debe ser un valor numérico mayor a cero".</w:t>
-      </w:r>
-    </w:p>
-    <w:p>
-      <w:pPr>
-        <w:pStyle w:val="Prrafodelista"/>
-        <w:numPr>
-          <w:ilvl w:val="0"/>
-          <w:numId w:val="1"/>
-        </w:numPr>
-        <w:ind w:left="426" w:hanging="66"/>
-        <w:jc w:val="both"/>
-        <w:rPr>
-          <w:rFonts w:ascii="Times New Roman" w:hAnsi="Times New Roman" w:cs="Times New Roman"/>
-          <w:b/>
-          <w:bCs/>
-        </w:rPr>
-      </w:pPr>
-      <w:r>
-        <w:rPr>
-          <w:rFonts w:ascii="Times New Roman" w:hAnsi="Times New Roman" w:cs="Times New Roman"/>
-          <w:b/>
-          <w:bCs/>
-        </w:rPr>
-        <w:t>Buscar productos por: código, nombre, categoría o rango de precios</w:t>
-      </w:r>
-      <w:r>
-        <w:rPr>
-          <w:rFonts w:ascii="Times New Roman" w:hAnsi="Times New Roman" w:cs="Times New Roman"/>
-          <w:b/>
-          <w:bCs/>
-        </w:rPr>
-        <w:t xml:space="preserve">: </w:t>
-      </w:r>
-      <w:r>
-        <w:rPr>
-          <w:rFonts w:ascii="Times New Roman" w:hAnsi="Times New Roman" w:cs="Times New Roman"/>
-        </w:rPr>
-        <w:t>permite a los usuarios localizar productos de manera rápida y eficiente utilizando diferentes criterios.</w:t>
-      </w:r>
-    </w:p>
-    <w:p>
-      <w:pPr>
-        <w:pStyle w:val="Prrafodelista"/>
-        <w:numPr>
-          <w:ilvl w:val="0"/>
-          <w:numId w:val="1"/>
-        </w:numPr>
-        <w:ind w:left="426" w:hanging="66"/>
-        <w:jc w:val="both"/>
-        <w:rPr>
-          <w:rFonts w:ascii="Times New Roman" w:hAnsi="Times New Roman" w:cs="Times New Roman"/>
-          <w:b/>
-          <w:bCs/>
-        </w:rPr>
-      </w:pPr>
-      <w:r>
-        <w:rPr>
-          <w:rFonts w:ascii="Times New Roman" w:eastAsia="Times New Roman" w:hAnsi="Times New Roman" w:cs="Times New Roman"/>
-          <w:b/>
-          <w:bCs/>
-          <w:color w:val="404040"/>
-          <w:kern w:val="0"/>
-          <w:lang w:eastAsia="es-PE"/>
-          <w14:ligatures w14:val="none"/>
-        </w:rPr>
-        <w:t>Alertar cuando stock sea menor a cantidad mínima configurable</w:t>
-      </w:r>
-      <w:r>
-        <w:rPr>
-          <w:rFonts w:ascii="Times New Roman" w:eastAsia="Times New Roman" w:hAnsi="Times New Roman" w:cs="Times New Roman"/>
-          <w:b/>
-          <w:bCs/>
-          <w:color w:val="404040"/>
-          <w:kern w:val="0"/>
-          <w:lang w:eastAsia="es-PE"/>
-          <w14:ligatures w14:val="none"/>
-        </w:rPr>
-        <w:t xml:space="preserve">: </w:t>
-      </w:r>
-      <w:r>
-        <w:rPr>
-          <w:rFonts w:ascii="Times New Roman" w:eastAsia="Times New Roman" w:hAnsi="Times New Roman" w:cs="Times New Roman"/>
-          <w:color w:val="404040"/>
-          <w:kern w:val="0"/>
-          <w:lang w:eastAsia="es-PE"/>
-          <w14:ligatures w14:val="none"/>
-        </w:rPr>
-        <w:t>permite al sistema monitorear automáticamente la cantidad de un producto en stock y generar una notificación o advertencia cuando dicha cantidad desciende</w:t>
-      </w:r>
-    </w:p>
-    <w:p>
-      <w:pPr>
-        <w:pStyle w:val="Prrafodelista"/>
-        <w:numPr>
-          <w:ilvl w:val="0"/>
-          <w:numId w:val="1"/>
-        </w:numPr>
-        <w:ind w:left="426" w:hanging="66"/>
-        <w:jc w:val="both"/>
-        <w:rPr>
-          <w:rFonts w:ascii="Times New Roman" w:hAnsi="Times New Roman" w:cs="Times New Roman"/>
-          <w:b/>
-          <w:bCs/>
-        </w:rPr>
-      </w:pPr>
-      <w:r>
-        <w:rPr>
-          <w:rFonts w:ascii="Times New Roman" w:hAnsi="Times New Roman" w:cs="Times New Roman"/>
-          <w:b/>
-          <w:bCs/>
-        </w:rPr>
-        <w:t>El sistema debe permitir consultar los detalles de un producto por su ID</w:t>
-      </w:r>
-      <w:r>
-        <w:rPr>
-          <w:rFonts w:ascii="Times New Roman" w:hAnsi="Times New Roman" w:cs="Times New Roman"/>
-          <w:b/>
-          <w:bCs/>
-        </w:rPr>
-        <w:t xml:space="preserve">: </w:t>
-      </w:r>
-      <w:r>
-        <w:rPr>
-          <w:rFonts w:ascii="Times New Roman" w:hAnsi="Times New Roman" w:cs="Times New Roman"/>
-        </w:rPr>
-        <w:t>Permite recuperar toda la información asociada a un producto específico de manera rápida y precisa, utilizando su identificador único.</w:t>
-      </w:r>
-    </w:p>
-    <w:p>
-      <w:pPr>
-        <w:pStyle w:val="Prrafodelista"/>
-        <w:numPr>
-          <w:ilvl w:val="0"/>
-          <w:numId w:val="1"/>
-        </w:numPr>
-        <w:ind w:left="426" w:hanging="66"/>
-        <w:jc w:val="both"/>
-        <w:rPr>
-          <w:rFonts w:ascii="Times New Roman" w:hAnsi="Times New Roman" w:cs="Times New Roman"/>
-          <w:b/>
-          <w:bCs/>
-        </w:rPr>
-      </w:pPr>
-      <w:r>
-        <w:rPr>
-          <w:rFonts w:ascii="Times New Roman" w:hAnsi="Times New Roman" w:cs="Times New Roman"/>
-          <w:b/>
-          <w:bCs/>
-        </w:rPr>
-        <w:t xml:space="preserve">El sistema debe permitir eliminar un producto del inventario por su ID: </w:t>
-      </w:r>
-      <w:r>
-        <w:rPr>
-          <w:rFonts w:ascii="Times New Roman" w:hAnsi="Times New Roman" w:cs="Times New Roman"/>
-        </w:rPr>
-        <w:t>Permite eliminar un producto, el sistema necesita que le proporciones ese ID único del producto que deseas remover.</w:t>
-      </w:r>
-    </w:p>
-    <w:p>
-      <w:pPr>
-        <w:pStyle w:val="Prrafodelista"/>
-        <w:numPr>
-          <w:ilvl w:val="0"/>
-          <w:numId w:val="1"/>
-        </w:numPr>
-        <w:ind w:left="426" w:hanging="66"/>
-        <w:jc w:val="both"/>
-        <w:rPr>
-          <w:rFonts w:ascii="Times New Roman" w:hAnsi="Times New Roman" w:cs="Times New Roman"/>
-          <w:b/>
-          <w:bCs/>
-        </w:rPr>
-      </w:pPr>
-      <w:r>
-        <w:rPr>
-          <w:rFonts w:ascii="Times New Roman" w:hAnsi="Times New Roman" w:cs="Times New Roman"/>
-          <w:b/>
-          <w:bCs/>
-        </w:rPr>
-        <w:t>Gestionar promociones (descuentos por producto/categoría)</w:t>
-      </w:r>
-      <w:r>
-        <w:rPr>
-          <w:rFonts w:ascii="Times New Roman" w:hAnsi="Times New Roman" w:cs="Times New Roman"/>
-          <w:b/>
-          <w:bCs/>
-        </w:rPr>
-        <w:t xml:space="preserve">: </w:t>
-      </w:r>
-      <w:r>
-        <w:rPr>
-          <w:rFonts w:ascii="Times New Roman" w:hAnsi="Times New Roman" w:cs="Times New Roman"/>
-        </w:rPr>
-        <w:t>Permite seleccionar uno o varios productos concretos para aplicar un descuento determinado.</w:t>
-      </w:r>
-    </w:p>
-    <w:p>
-      <w:pPr>
-        <w:pStyle w:val="Prrafodelista"/>
-        <w:numPr>
-          <w:ilvl w:val="0"/>
-          <w:numId w:val="1"/>
-        </w:numPr>
-        <w:ind w:left="426" w:hanging="66"/>
-        <w:jc w:val="both"/>
-        <w:rPr>
-          <w:rFonts w:ascii="Times New Roman" w:hAnsi="Times New Roman" w:cs="Times New Roman"/>
-          <w:b/>
-          <w:bCs/>
-        </w:rPr>
-      </w:pPr>
-      <w:r>
-        <w:rPr>
-          <w:rFonts w:ascii="Times New Roman" w:hAnsi="Times New Roman" w:cs="Times New Roman"/>
-          <w:b/>
-          <w:bCs/>
-        </w:rPr>
-        <w:t>El sistema debe listar todos los productos actualmente en el inventario</w:t>
-      </w:r>
-      <w:r>
-        <w:rPr>
-          <w:rFonts w:ascii="Times New Roman" w:hAnsi="Times New Roman" w:cs="Times New Roman"/>
-          <w:b/>
-          <w:bCs/>
-        </w:rPr>
-        <w:t>:</w:t>
-      </w:r>
-      <w:r>
-        <w:rPr>
-          <w:rFonts w:ascii="Times New Roman" w:hAnsi="Times New Roman" w:cs="Times New Roman"/>
-        </w:rPr>
-        <w:t xml:space="preserve"> Permite visualizar de forma clara y organizada todos los artículos disponibles.</w:t>
-      </w:r>
-    </w:p>
-    <w:p>
-      <w:pPr>
-        <w:pStyle w:val="Prrafodelista"/>
-        <w:numPr>
-          <w:ilvl w:val="0"/>
-          <w:numId w:val="1"/>
-        </w:numPr>
-        <w:ind w:left="426" w:hanging="66"/>
-        <w:jc w:val="both"/>
-        <w:rPr>
-          <w:rFonts w:ascii="Times New Roman" w:hAnsi="Times New Roman" w:cs="Times New Roman"/>
-          <w:b/>
-          <w:bCs/>
-        </w:rPr>
-      </w:pPr>
-      <w:r>
-        <w:rPr>
-          <w:rFonts w:ascii="Times New Roman" w:hAnsi="Times New Roman" w:cs="Times New Roman"/>
-          <w:b/>
-          <w:bCs/>
-        </w:rPr>
         <w:t>El sistema debe mostrar el ID, nombre, precio y stock de cada producto en la lista</w:t>
       </w:r>
       <w:r>
@@ -4305,6 +4274,7 @@
           <w:b/>
           <w:bCs/>
         </w:rPr>
+        <w:lastRenderedPageBreak/>
         <w:t>Notas y comentarios de clientes</w:t>
       </w:r>
       <w:r>
@@ -4351,7 +4321,6 @@
           <w:b/>
           <w:bCs/>
         </w:rPr>
-        <w:lastRenderedPageBreak/>
         <w:t>Gestión de la comunicación con el cliente</w:t>
       </w:r>
       <w:r>
@@ -5040,17 +5009,7 @@
           <w:lang w:val="es-MX" w:eastAsia="es-MX"/>
           <w14:ligatures w14:val="none"/>
         </w:rPr>
-        <w:t> El sistema debe permitir buscar el producto por su nombre o código. El sistema debe mostrar los campos editables del producto (nombre, descripción, precio, stock, categoría). Los cambios deben guardarse correctamente y reflejarse en el catálogo.</w:t>
-      </w:r>
-      <w:r>
-        <w:rPr>
-          <w:rFonts w:ascii="Times New Roman" w:eastAsia="Times New Roman" w:hAnsi="Times New Roman" w:cs="Times New Roman"/>
-          <w:color w:val="000000"/>
-          <w:kern w:val="0"/>
-          <w:lang w:val="es-MX" w:eastAsia="es-MX"/>
-          <w14:ligatures w14:val="none"/>
-        </w:rPr>
-        <w:t xml:space="preserve"> </w:t>
+        <w:t xml:space="preserve"> El sistema debe permitir buscar el producto por su nombre o código. El sistema debe mostrar los campos editables del producto (nombre, descripción, precio, stock, categoría). Los cambios deben guardarse correctamente y reflejarse en el catálogo. </w:t>
       </w:r>
     </w:p>
     <w:p>
@@ -5117,6 +5076,7 @@
           <w:lang w:val="es-MX" w:eastAsia="es-MX"/>
           <w14:ligatures w14:val="none"/>
         </w:rPr>
+        <w:lastRenderedPageBreak/>
         <w:t>Como:</w:t>
       </w:r>
       <w:r>
@@ -5197,7 +5157,6 @@
           <w:lang w:val="es-MX" w:eastAsia="es-MX"/>
           <w14:ligatures w14:val="none"/>
         </w:rPr>
-        <w:lastRenderedPageBreak/>
         <w:t>Para:</w:t>
       </w:r>
       <w:r>
@@ -6016,6 +5975,7 @@
           <w:lang w:val="es-MX" w:eastAsia="es-MX"/>
           <w14:ligatures w14:val="none"/>
         </w:rPr>
+        <w:lastRenderedPageBreak/>
         <w:t>8. Gestión de usuario y contraseña:</w:t>
       </w:r>
       <w:r>
@@ -6056,7 +6016,6 @@
           <w:lang w:val="es-MX" w:eastAsia="es-MX"/>
           <w14:ligatures w14:val="none"/>
         </w:rPr>
-        <w:lastRenderedPageBreak/>
         <w:t>Como:</w:t>
       </w:r>
       <w:r>
@@ -6917,6 +6876,7 @@
           <w:lang w:val="es-MX" w:eastAsia="es-MX"/>
           <w14:ligatures w14:val="none"/>
         </w:rPr>
+        <w:lastRenderedPageBreak/>
         <w:t>Criterios de Aceptación:</w:t>
       </w:r>
       <w:r>
@@ -6927,18 +6887,7 @@
           <w:lang w:val="es-MX" w:eastAsia="es-MX"/>
           <w14:ligatures w14:val="none"/>
         </w:rPr>
-        <w:t xml:space="preserve"> El sistema debe permitir buscar la venta original asociada a la devolución. El sistema debe permitir seleccionar los productos a </w:t>
-      </w:r>
-      <w:r>
-        <w:rPr>
-          <w:rFonts w:ascii="Times New Roman" w:eastAsia="Times New Roman" w:hAnsi="Times New Roman" w:cs="Times New Roman"/>
-          <w:color w:val="000000"/>
-          <w:kern w:val="0"/>
-          <w:lang w:val="es-MX" w:eastAsia="es-MX"/>
-          <w14:ligatures w14:val="none"/>
-        </w:rPr>
-        <w:lastRenderedPageBreak/>
-        <w:t>devolver y las cantidades. La transacción de devolución debe quedar registrada en el historial de ventas y en el historial del cliente (si aplica).</w:t>
+        <w:t> El sistema debe permitir buscar la venta original asociada a la devolución. El sistema debe permitir seleccionar los productos a devolver y las cantidades. La transacción de devolución debe quedar registrada en el historial de ventas y en el historial del cliente (si aplica).</w:t>
       </w:r>
     </w:p>
     <w:p>

</xml_diff>